<commit_message>
Dolphins: add the two held passages (Lothar, 11 Oct): Winnie-the-Pooh in the China chapter (leader unnamed: 'the leader the internet nicknamed Pooh') and the Greenland purchase offers in the Climate chapter (1946, 2019, 2024-25; the president never named); port the physics chapter's 'The rest of the ledger' (trimmed, corrected); 21 new linked notes; rebuilt master (61,323 -> 62,662 words); old master in bak/2026-10-11 pre-held-back
</commit_message>
<xml_diff>
--- a/The Dolphins' View of History/chapters/31 - China, the Long Memory and the Great Leap.docx
+++ b/The Dolphins' View of History/chapters/31 - China, the Long Memory and the Great Leap.docx
@@ -125,6 +125,22 @@
       </w:pPr>
       <w:r>
         <w:t xml:space="preserve">The political side of the ledger tightened. Xi Jinping took the top posts in 2012 and in 2018 removed the two-term limit on the presidency, ending the arrangement that had made leadership change hands every decade. An anti-corruption campaign jailed rivals along with a great many officials who were, in fact, corrupt. In Xinjiang the state built a system of mass detention and surveillance aimed at Uyghurs and other largely Muslim minorities, documented by researchers, leaked police files, and satellite imagery, and described by Beijing as vocational training. In Hong Kong a 2020 national-security law curtailed the autonomy the 1997 handover had promised.</w:t>
+      </w:r>
+    </w:p>
+    <w:p>
+      <w:pPr>
+        <w:spacing w:after="200"/>
+      </w:pPr>
+      <w:r>
+        <w:t xml:space="preserve">The tightening had a lighter footnote, which the state did not treat lightly. The leader the internet nicknamed Pooh earned the name in 2013, when he walked with the American president at Sunnylands in California and Chinese social media users posted the photograph beside a drawing of Winnie-the-Pooh strolling with Tigger. In 2014 a handshake with Japan’s prime minister was matched with Pooh gripping the hoof of a gloomy Eeyore. In 2017, in the run-up to a party congress, comments using the bear’s Chinese name, Little Bear Winnie, began failing on Weibo with a warning that the content was illegal, and Pooh stickers disappeared from WeChat’s official gallery. No reason was given.</w:t>
+      </w:r>
+    </w:p>
+    <w:p>
+      <w:pPr>
+        <w:spacing w:after="200"/>
+      </w:pPr>
+      <w:r>
+        <w:t xml:space="preserve">Dolphin historians do not consider the resemblance their business. They consider the ban their business. A state with a nuclear arsenal, a censorship apparatus, and the largest online population on Earth arranged to be threatened by a Bear of Very Little Brain. A government that feels secure can live with a joke. One that does not deletes it, and the deletion becomes the better-known joke.</w:t>
       </w:r>
     </w:p>
     <w:p>

</xml_diff>

<commit_message>
Dolphins' View of History onto main, paths only (from book-2-lectures-after-qed 4cc4f27..ad754c9): Winnie-the-Pooh and Greenland passages added, physics 'The rest of the ledger' ported, 21 new linked notes, .md track resynced, notes updated
</commit_message>
<xml_diff>
--- a/The Dolphins' View of History/chapters/31 - China, the Long Memory and the Great Leap.docx
+++ b/The Dolphins' View of History/chapters/31 - China, the Long Memory and the Great Leap.docx
@@ -125,6 +125,22 @@
       </w:pPr>
       <w:r>
         <w:t xml:space="preserve">The political side of the ledger tightened. Xi Jinping took the top posts in 2012 and in 2018 removed the two-term limit on the presidency, ending the arrangement that had made leadership change hands every decade. An anti-corruption campaign jailed rivals along with a great many officials who were, in fact, corrupt. In Xinjiang the state built a system of mass detention and surveillance aimed at Uyghurs and other largely Muslim minorities, documented by researchers, leaked police files, and satellite imagery, and described by Beijing as vocational training. In Hong Kong a 2020 national-security law curtailed the autonomy the 1997 handover had promised.</w:t>
+      </w:r>
+    </w:p>
+    <w:p>
+      <w:pPr>
+        <w:spacing w:after="200"/>
+      </w:pPr>
+      <w:r>
+        <w:t xml:space="preserve">The tightening had a lighter footnote, which the state did not treat lightly. The leader the internet nicknamed Pooh earned the name in 2013, when he walked with the American president at Sunnylands in California and Chinese social media users posted the photograph beside a drawing of Winnie-the-Pooh strolling with Tigger. In 2014 a handshake with Japan’s prime minister was matched with Pooh gripping the hoof of a gloomy Eeyore. In 2017, in the run-up to a party congress, comments using the bear’s Chinese name, Little Bear Winnie, began failing on Weibo with a warning that the content was illegal, and Pooh stickers disappeared from WeChat’s official gallery. No reason was given.</w:t>
+      </w:r>
+    </w:p>
+    <w:p>
+      <w:pPr>
+        <w:spacing w:after="200"/>
+      </w:pPr>
+      <w:r>
+        <w:t xml:space="preserve">Dolphin historians do not consider the resemblance their business. They consider the ban their business. A state with a nuclear arsenal, a censorship apparatus, and the largest online population on Earth arranged to be threatened by a Bear of Very Little Brain. A government that feels secure can live with a joke. One that does not deletes it, and the deletion becomes the better-known joke.</w:t>
       </w:r>
     </w:p>
     <w:p>

</xml_diff>